<commit_message>
feat: Officials route completely functional
</commit_message>
<xml_diff>
--- a/bin/Sprint Progress [Active].docx
+++ b/bin/Sprint Progress [Active].docx
@@ -34,8 +34,6 @@
           <w:rFonts w:ascii="Times New Roman" w:hAnsi="Times New Roman" w:cs="Times New Roman"/>
           <w:b/>
           <w:bCs/>
-          <w:sz w:val="28"/>
-          <w:szCs w:val="28"/>
           <w:lang w:val="en-US"/>
         </w:rPr>
       </w:pPr>
@@ -44,8 +42,6 @@
           <w:rFonts w:ascii="Times New Roman" w:hAnsi="Times New Roman" w:cs="Times New Roman"/>
           <w:b/>
           <w:bCs/>
-          <w:sz w:val="28"/>
-          <w:szCs w:val="28"/>
           <w:lang w:val="en-US"/>
         </w:rPr>
         <w:t>Authentication</w:t>
@@ -75,12 +71,25 @@
           <w:lang w:val="en-US"/>
         </w:rPr>
       </w:pPr>
+    </w:p>
+    <w:p>
+      <w:pPr>
+        <w:spacing w:after="0"/>
+        <w:rPr>
+          <w:rFonts w:ascii="Times New Roman" w:hAnsi="Times New Roman" w:cs="Times New Roman"/>
+          <w:b/>
+          <w:bCs/>
+          <w:lang w:val="en-US"/>
+        </w:rPr>
+      </w:pPr>
       <w:r>
         <w:rPr>
           <w:rFonts w:ascii="Times New Roman" w:hAnsi="Times New Roman" w:cs="Times New Roman"/>
+          <w:b/>
+          <w:bCs/>
           <w:lang w:val="en-US"/>
         </w:rPr>
-        <w:t>Navbar requires a refresh after login</w:t>
+        <w:t>Image Upload</w:t>
       </w:r>
     </w:p>
     <w:p>
@@ -91,6 +100,21 @@
           <w:lang w:val="en-US"/>
         </w:rPr>
       </w:pPr>
+      <w:r>
+        <w:rPr>
+          <w:rFonts w:ascii="Times New Roman" w:hAnsi="Times New Roman" w:cs="Times New Roman"/>
+          <w:lang w:val="en-US"/>
+        </w:rPr>
+        <w:t>Add Geocoding to Image Upload</w:t>
+      </w:r>
+      <w:r>
+        <w:rPr>
+          <w:rFonts w:ascii="Times New Roman" w:hAnsi="Times New Roman" w:cs="Times New Roman"/>
+          <w:lang w:val="en-US"/>
+        </w:rPr>
+        <w:br/>
+        <w:t>Use Geocoding at storing reports</w:t>
+      </w:r>
     </w:p>
     <w:sectPr>
       <w:pgSz w:w="11906" w:h="16838"/>

</xml_diff>

<commit_message>
feat: Heavily refactored Admin dashboard. Dummy data is resolved at admin
</commit_message>
<xml_diff>
--- a/bin/Sprint Progress [Active].docx
+++ b/bin/Sprint Progress [Active].docx
@@ -114,6 +114,94 @@
         </w:rPr>
         <w:br/>
         <w:t>Use Geocoding at storing reports</w:t>
+      </w:r>
+    </w:p>
+    <w:p>
+      <w:pPr>
+        <w:spacing w:after="0"/>
+        <w:rPr>
+          <w:rFonts w:ascii="Times New Roman" w:hAnsi="Times New Roman" w:cs="Times New Roman"/>
+          <w:lang w:val="en-US"/>
+        </w:rPr>
+      </w:pPr>
+    </w:p>
+    <w:p>
+      <w:pPr>
+        <w:spacing w:after="0"/>
+        <w:rPr>
+          <w:rFonts w:ascii="Times New Roman" w:hAnsi="Times New Roman" w:cs="Times New Roman"/>
+          <w:lang w:val="en-US"/>
+        </w:rPr>
+      </w:pPr>
+      <w:r>
+        <w:rPr>
+          <w:rFonts w:ascii="Times New Roman" w:hAnsi="Times New Roman" w:cs="Times New Roman"/>
+          <w:b/>
+          <w:bCs/>
+          <w:lang w:val="en-US"/>
+        </w:rPr>
+        <w:t>Officials Page</w:t>
+      </w:r>
+    </w:p>
+    <w:p>
+      <w:pPr>
+        <w:spacing w:after="0"/>
+        <w:rPr>
+          <w:rFonts w:ascii="Times New Roman" w:hAnsi="Times New Roman" w:cs="Times New Roman"/>
+          <w:lang w:val="en-US"/>
+        </w:rPr>
+      </w:pPr>
+      <w:r>
+        <w:rPr>
+          <w:rFonts w:ascii="Times New Roman" w:hAnsi="Times New Roman" w:cs="Times New Roman"/>
+          <w:lang w:val="en-US"/>
+        </w:rPr>
+        <w:t>Enable Geocoding for Maps</w:t>
+      </w:r>
+    </w:p>
+    <w:p>
+      <w:pPr>
+        <w:spacing w:after="0"/>
+        <w:rPr>
+          <w:rFonts w:ascii="Times New Roman" w:hAnsi="Times New Roman" w:cs="Times New Roman"/>
+          <w:lang w:val="en-US"/>
+        </w:rPr>
+      </w:pPr>
+    </w:p>
+    <w:p>
+      <w:pPr>
+        <w:spacing w:after="0"/>
+        <w:rPr>
+          <w:rFonts w:ascii="Times New Roman" w:hAnsi="Times New Roman" w:cs="Times New Roman"/>
+          <w:b/>
+          <w:bCs/>
+          <w:lang w:val="en-US"/>
+        </w:rPr>
+      </w:pPr>
+      <w:r>
+        <w:rPr>
+          <w:rFonts w:ascii="Times New Roman" w:hAnsi="Times New Roman" w:cs="Times New Roman"/>
+          <w:b/>
+          <w:bCs/>
+          <w:lang w:val="en-US"/>
+        </w:rPr>
+        <w:t>Admin Dashboard</w:t>
+      </w:r>
+    </w:p>
+    <w:p>
+      <w:pPr>
+        <w:spacing w:after="0"/>
+        <w:rPr>
+          <w:rFonts w:ascii="Times New Roman" w:hAnsi="Times New Roman" w:cs="Times New Roman"/>
+          <w:lang w:val="en-US"/>
+        </w:rPr>
+      </w:pPr>
+      <w:r>
+        <w:rPr>
+          <w:rFonts w:ascii="Times New Roman" w:hAnsi="Times New Roman" w:cs="Times New Roman"/>
+          <w:lang w:val="en-US"/>
+        </w:rPr>
+        <w:t>Enable Real-Time data management</w:t>
       </w:r>
     </w:p>
     <w:sectPr>

</xml_diff>